<commit_message>
Correct entity to Cohort Logic, LLC; add Stripe billing DB migration
- Entity confirmed by owner as Cohort Logic, LLC (not "PBC" — a PBC is a different
  entity type). Corrected across compliance docs 16/17/18/20/22 and tracker
  BI-01/VQ-01. NOTE: the live site footers say "Cohort Logic, PBC" on 10 pages
  (index, pricing, products, security, contact, resources, class-builder,
  schedule-builder [+JSON-LD], balanced-classes, prepare-student-roster) — left
  unchanged pending the reviewed website batch.
- supabase/migrations/stripe_billing.sql: additive Stripe linkage columns on
  subscriptions (customer/subscription/price ids, current_period_end,
  cancel_at_period_end) + unique indexes. Webhook (service-role) is the single
  writer; RLS unchanged. Run in the SQL editor when ready.

Co-Authored-By: Claude Opus 4.8 (1M context) <noreply@anthropic.com>
</commit_message>
<xml_diff>
--- a/compliance/16_Go_To_Market_Scope.docx
+++ b/compliance/16_Go_To_Market_Scope.docx
@@ -674,7 +674,22 @@
           <w:rFonts w:ascii="Arial" w:hAnsi="Arial"/>
           <w:sz w:val="21"/>
         </w:rPr>
-        <w:t>Confirm legal entity (resolve the "PBC" vs LLC label), EIN + W-9, business banking — BI-01/02/03</w:t>
+        <w:t xml:space="preserve">Entity confirmed: </w:t>
+      </w:r>
+      <w:r>
+        <w:rPr>
+          <w:rFonts w:ascii="Arial" w:hAnsi="Arial"/>
+          <w:b/>
+          <w:sz w:val="21"/>
+        </w:rPr>
+        <w:t>Cohort Logic, LLC</w:t>
+      </w:r>
+      <w:r>
+        <w:rPr>
+          <w:rFonts w:ascii="Arial" w:hAnsi="Arial"/>
+          <w:sz w:val="21"/>
+        </w:rPr>
+        <w:t xml:space="preserve"> (fix the site footers, which wrongly say "PBC"); EIN + W-9, business banking — BI-01/02/03</w:t>
       </w:r>
     </w:p>
     <w:p>

</xml_diff>